<commit_message>
made some changes in Test_Plan
</commit_message>
<xml_diff>
--- a/HMS_Test_Plan.docx
+++ b/HMS_Test_Plan.docx
@@ -151,44 +151,82 @@
         <w:t>Giriyapanavar</w:t>
       </w:r>
       <w:proofErr w:type="spellEnd"/>
+      <w:r>
+        <w:rPr>
+          <w:sz w:val="28"/>
+          <w:szCs w:val="28"/>
+          <w:lang w:val="en-US"/>
+        </w:rPr>
+        <w:t xml:space="preserve"> – </w:t>
+      </w:r>
+      <w:r>
+        <w:rPr>
+          <w:sz w:val="28"/>
+          <w:szCs w:val="28"/>
+          <w:lang w:val="en-US"/>
+        </w:rPr>
+        <w:t>PES1UG24CS</w:t>
+      </w:r>
+      <w:r>
+        <w:rPr>
+          <w:sz w:val="28"/>
+          <w:szCs w:val="28"/>
+          <w:lang w:val="en-US"/>
+        </w:rPr>
+        <w:t>924</w:t>
+      </w:r>
     </w:p>
     <w:p>
       <w:pPr>
-        <w:ind w:left="720" w:firstLine="720"/>
+        <w:tabs>
+          <w:tab w:val="left" w:pos="5138"/>
+        </w:tabs>
         <w:rPr>
           <w:sz w:val="28"/>
           <w:szCs w:val="28"/>
           <w:lang w:val="en-US"/>
         </w:rPr>
       </w:pPr>
-      <w:proofErr w:type="spellStart"/>
       <w:r>
         <w:rPr>
           <w:sz w:val="28"/>
           <w:szCs w:val="28"/>
           <w:lang w:val="en-US"/>
         </w:rPr>
-        <w:t>Chiranthan</w:t>
+        <w:t xml:space="preserve">                      </w:t>
       </w:r>
-      <w:proofErr w:type="spellEnd"/>
       <w:r>
         <w:rPr>
           <w:sz w:val="28"/>
           <w:szCs w:val="28"/>
           <w:lang w:val="en-US"/>
         </w:rPr>
-        <w:t xml:space="preserve"> </w:t>
+        <w:t>Chiranthan Sathrasala</w:t>
       </w:r>
-      <w:proofErr w:type="spellStart"/>
       <w:r>
         <w:rPr>
           <w:sz w:val="28"/>
           <w:szCs w:val="28"/>
           <w:lang w:val="en-US"/>
         </w:rPr>
-        <w:t>Sathrasala</w:t>
+        <w:t xml:space="preserve"> - </w:t>
       </w:r>
-      <w:proofErr w:type="spellEnd"/>
+      <w:r>
+        <w:rPr>
+          <w:sz w:val="28"/>
+          <w:szCs w:val="28"/>
+          <w:lang w:val="en-US"/>
+        </w:rPr>
+        <w:t>PES1UG24CS5</w:t>
+      </w:r>
+      <w:r>
+        <w:rPr>
+          <w:sz w:val="28"/>
+          <w:szCs w:val="28"/>
+          <w:lang w:val="en-US"/>
+        </w:rPr>
+        <w:t>65</w:t>
+      </w:r>
     </w:p>
     <w:p>
       <w:pPr>
@@ -207,6 +245,22 @@
         </w:rPr>
         <w:t>Neha K S</w:t>
       </w:r>
+      <w:r>
+        <w:rPr>
+          <w:sz w:val="28"/>
+          <w:szCs w:val="28"/>
+          <w:lang w:val="en-US"/>
+        </w:rPr>
+        <w:t xml:space="preserve"> - </w:t>
+      </w:r>
+      <w:r>
+        <w:rPr>
+          <w:sz w:val="28"/>
+          <w:szCs w:val="28"/>
+          <w:lang w:val="en-US"/>
+        </w:rPr>
+        <w:t>PES1UG24CS581</w:t>
+      </w:r>
     </w:p>
     <w:p>
       <w:pPr>
@@ -224,6 +278,30 @@
           <w:lang w:val="en-US"/>
         </w:rPr>
         <w:t>Harsh M</w:t>
+      </w:r>
+      <w:r>
+        <w:rPr>
+          <w:sz w:val="28"/>
+          <w:szCs w:val="28"/>
+          <w:lang w:val="en-US"/>
+        </w:rPr>
+        <w:t xml:space="preserve"> - </w:t>
+      </w:r>
+      <w:r>
+        <w:rPr>
+          <w:sz w:val="28"/>
+          <w:szCs w:val="28"/>
+          <w:lang w:val="en-US"/>
+        </w:rPr>
+        <w:t>PES1UG24CS5</w:t>
+      </w:r>
+      <w:r>
+        <w:rPr>
+          <w:sz w:val="28"/>
+          <w:szCs w:val="28"/>
+          <w:lang w:val="en-US"/>
+        </w:rPr>
+        <w:t>73</w:t>
       </w:r>
     </w:p>
     <w:p>
@@ -281,6 +359,13 @@
           <w:lang w:val="en-US"/>
         </w:rPr>
         <w:t>Chiranthan Sathrasala</w:t>
+      </w:r>
+      <w:r>
+        <w:rPr>
+          <w:sz w:val="28"/>
+          <w:lang w:val="en-US"/>
+        </w:rPr>
+        <w:t xml:space="preserve"> &amp; Harsh M</w:t>
       </w:r>
     </w:p>
     <w:p>
@@ -479,24 +564,6 @@
     <w:p>
       <w:pPr>
         <w:rPr>
-          <w:sz w:val="28"/>
-          <w:szCs w:val="28"/>
-          <w:lang w:val="en-US"/>
-        </w:rPr>
-      </w:pPr>
-    </w:p>
-    <w:p>
-      <w:pPr>
-        <w:rPr>
-          <w:sz w:val="28"/>
-          <w:szCs w:val="28"/>
-          <w:lang w:val="en-US"/>
-        </w:rPr>
-      </w:pPr>
-    </w:p>
-    <w:p>
-      <w:pPr>
-        <w:rPr>
           <w:b/>
           <w:bCs/>
           <w:sz w:val="28"/>
@@ -512,6 +579,7 @@
           <w:szCs w:val="28"/>
           <w:lang w:val="en-US"/>
         </w:rPr>
+        <w:lastRenderedPageBreak/>
         <w:t>FR-001: Student Registration and Login</w:t>
       </w:r>
     </w:p>
@@ -1739,7 +1807,75 @@
                 <w:sz w:val="16"/>
                 <w:lang w:val="en-US"/>
               </w:rPr>
-              <w:t xml:space="preserve">Trigger account lockout after 5 consecutive </w:t>
+              <w:t>Trigger account lockout after 5 consecutive failed login attempts</w:t>
+            </w:r>
+          </w:p>
+        </w:tc>
+        <w:tc>
+          <w:tcPr>
+            <w:tcW w:w="1050" w:type="dxa"/>
+          </w:tcPr>
+          <w:p>
+            <w:pPr>
+              <w:spacing w:after="40"/>
+            </w:pPr>
+            <w:r>
+              <w:rPr>
+                <w:sz w:val="16"/>
+                <w:lang w:val="en-US"/>
+              </w:rPr>
+              <w:t>Student is registered; account currently unlocked</w:t>
+            </w:r>
+          </w:p>
+        </w:tc>
+        <w:tc>
+          <w:tcPr>
+            <w:tcW w:w="1300" w:type="dxa"/>
+          </w:tcPr>
+          <w:p>
+            <w:pPr>
+              <w:spacing w:after="40"/>
+            </w:pPr>
+            <w:r>
+              <w:rPr>
+                <w:sz w:val="16"/>
+                <w:lang w:val="en-US"/>
+              </w:rPr>
+              <w:t>1. Attempt login with wrong password 5 times in a row 2. Attempt a 6th login with the correct password</w:t>
+            </w:r>
+          </w:p>
+        </w:tc>
+        <w:tc>
+          <w:tcPr>
+            <w:tcW w:w="1050" w:type="dxa"/>
+          </w:tcPr>
+          <w:p>
+            <w:pPr>
+              <w:spacing w:after="40"/>
+            </w:pPr>
+            <w:r>
+              <w:rPr>
+                <w:sz w:val="16"/>
+                <w:lang w:val="en-US"/>
+              </w:rPr>
+              <w:t>Password attempts: WrongPass1 (x5), then Pass@123</w:t>
+            </w:r>
+          </w:p>
+        </w:tc>
+        <w:tc>
+          <w:tcPr>
+            <w:tcW w:w="1300" w:type="dxa"/>
+          </w:tcPr>
+          <w:p>
+            <w:pPr>
+              <w:spacing w:after="40"/>
+            </w:pPr>
+            <w:r>
+              <w:rPr>
+                <w:sz w:val="16"/>
+                <w:lang w:val="en-US"/>
+              </w:rPr>
+              <w:t xml:space="preserve">Account locked after 5th failed attempt; 6th attempt (even with correct password) rejected with "Account </w:t>
             </w:r>
             <w:r>
               <w:rPr>
@@ -1747,111 +1883,7 @@
                 <w:lang w:val="en-US"/>
               </w:rPr>
               <w:lastRenderedPageBreak/>
-              <w:t>failed login attempts</w:t>
-            </w:r>
-          </w:p>
-        </w:tc>
-        <w:tc>
-          <w:tcPr>
-            <w:tcW w:w="1050" w:type="dxa"/>
-          </w:tcPr>
-          <w:p>
-            <w:pPr>
-              <w:spacing w:after="40"/>
-            </w:pPr>
-            <w:r>
-              <w:rPr>
-                <w:sz w:val="16"/>
-                <w:lang w:val="en-US"/>
-              </w:rPr>
-              <w:lastRenderedPageBreak/>
-              <w:t xml:space="preserve">Student is registered; account </w:t>
-            </w:r>
-            <w:r>
-              <w:rPr>
-                <w:sz w:val="16"/>
-                <w:lang w:val="en-US"/>
-              </w:rPr>
-              <w:lastRenderedPageBreak/>
-              <w:t>currently unlocked</w:t>
-            </w:r>
-          </w:p>
-        </w:tc>
-        <w:tc>
-          <w:tcPr>
-            <w:tcW w:w="1300" w:type="dxa"/>
-          </w:tcPr>
-          <w:p>
-            <w:pPr>
-              <w:spacing w:after="40"/>
-            </w:pPr>
-            <w:r>
-              <w:rPr>
-                <w:sz w:val="16"/>
-                <w:lang w:val="en-US"/>
-              </w:rPr>
-              <w:lastRenderedPageBreak/>
-              <w:t xml:space="preserve">1. Attempt login with wrong password 5 </w:t>
-            </w:r>
-            <w:r>
-              <w:rPr>
-                <w:sz w:val="16"/>
-                <w:lang w:val="en-US"/>
-              </w:rPr>
-              <w:lastRenderedPageBreak/>
-              <w:t>times in a row 2. Attempt a 6th login with the correct password</w:t>
-            </w:r>
-          </w:p>
-        </w:tc>
-        <w:tc>
-          <w:tcPr>
-            <w:tcW w:w="1050" w:type="dxa"/>
-          </w:tcPr>
-          <w:p>
-            <w:pPr>
-              <w:spacing w:after="40"/>
-            </w:pPr>
-            <w:r>
-              <w:rPr>
-                <w:sz w:val="16"/>
-                <w:lang w:val="en-US"/>
-              </w:rPr>
-              <w:lastRenderedPageBreak/>
-              <w:t xml:space="preserve">Password attempts: WrongPass1 </w:t>
-            </w:r>
-            <w:r>
-              <w:rPr>
-                <w:sz w:val="16"/>
-                <w:lang w:val="en-US"/>
-              </w:rPr>
-              <w:lastRenderedPageBreak/>
-              <w:t>(x5), then Pass@123</w:t>
-            </w:r>
-          </w:p>
-        </w:tc>
-        <w:tc>
-          <w:tcPr>
-            <w:tcW w:w="1300" w:type="dxa"/>
-          </w:tcPr>
-          <w:p>
-            <w:pPr>
-              <w:spacing w:after="40"/>
-            </w:pPr>
-            <w:r>
-              <w:rPr>
-                <w:sz w:val="16"/>
-                <w:lang w:val="en-US"/>
-              </w:rPr>
-              <w:lastRenderedPageBreak/>
-              <w:t xml:space="preserve">Account locked after 5th failed attempt; 6th </w:t>
-            </w:r>
-            <w:r>
-              <w:rPr>
-                <w:sz w:val="16"/>
-                <w:lang w:val="en-US"/>
-              </w:rPr>
-              <w:lastRenderedPageBreak/>
-              <w:t>attempt (even with correct password) rejected with "Account locked, try again in 15 minutes"</w:t>
+              <w:t>locked, try again in 15 minutes"</w:t>
             </w:r>
           </w:p>
         </w:tc>
@@ -3041,15 +3073,7 @@
                 <w:sz w:val="16"/>
                 <w:lang w:val="en-US"/>
               </w:rPr>
-              <w:t xml:space="preserve">Room occupancy decreases by 1; allocation record marked </w:t>
-            </w:r>
-            <w:r>
-              <w:rPr>
-                <w:sz w:val="16"/>
-                <w:lang w:val="en-US"/>
-              </w:rPr>
-              <w:lastRenderedPageBreak/>
-              <w:t>inactive; student shows "No room allocated"</w:t>
+              <w:t>Room occupancy decreases by 1; allocation record marked inactive; student shows "No room allocated"</w:t>
             </w:r>
           </w:p>
         </w:tc>
@@ -3088,6 +3112,7 @@
                 <w:sz w:val="16"/>
                 <w:lang w:val="en-US"/>
               </w:rPr>
+              <w:lastRenderedPageBreak/>
               <w:t>IT-05</w:t>
             </w:r>
           </w:p>
@@ -4419,58 +4444,66 @@
                 <w:sz w:val="16"/>
                 <w:lang w:val="en-US"/>
               </w:rPr>
+              <w:t>IT-06</w:t>
+            </w:r>
+          </w:p>
+        </w:tc>
+        <w:tc>
+          <w:tcPr>
+            <w:tcW w:w="850" w:type="dxa"/>
+          </w:tcPr>
+          <w:p>
+            <w:pPr>
+              <w:spacing w:after="40"/>
+            </w:pPr>
+            <w:r>
+              <w:rPr>
+                <w:sz w:val="16"/>
+                <w:lang w:val="en-US"/>
+              </w:rPr>
+              <w:t>Fee Tracking</w:t>
+            </w:r>
+          </w:p>
+        </w:tc>
+        <w:tc>
+          <w:tcPr>
+            <w:tcW w:w="1300" w:type="dxa"/>
+          </w:tcPr>
+          <w:p>
+            <w:pPr>
+              <w:spacing w:after="40"/>
+            </w:pPr>
+            <w:r>
+              <w:rPr>
+                <w:sz w:val="16"/>
+                <w:lang w:val="en-US"/>
+              </w:rPr>
+              <w:t xml:space="preserve">Verify student dashboard reflects updated fee status </w:t>
+            </w:r>
+            <w:r>
+              <w:rPr>
+                <w:sz w:val="16"/>
+                <w:lang w:val="en-US"/>
+              </w:rPr>
               <w:lastRenderedPageBreak/>
-              <w:t>IT-06</w:t>
-            </w:r>
-          </w:p>
-        </w:tc>
-        <w:tc>
-          <w:tcPr>
-            <w:tcW w:w="850" w:type="dxa"/>
-          </w:tcPr>
-          <w:p>
-            <w:pPr>
-              <w:spacing w:after="40"/>
-            </w:pPr>
-            <w:r>
-              <w:rPr>
-                <w:sz w:val="16"/>
-                <w:lang w:val="en-US"/>
-              </w:rPr>
-              <w:t>Fee Tracking</w:t>
-            </w:r>
-          </w:p>
-        </w:tc>
-        <w:tc>
-          <w:tcPr>
-            <w:tcW w:w="1300" w:type="dxa"/>
-          </w:tcPr>
-          <w:p>
-            <w:pPr>
-              <w:spacing w:after="40"/>
-            </w:pPr>
-            <w:r>
-              <w:rPr>
-                <w:sz w:val="16"/>
-                <w:lang w:val="en-US"/>
-              </w:rPr>
-              <w:t>Verify student dashboard reflects updated fee status immediately after admin records payment</w:t>
-            </w:r>
-          </w:p>
-        </w:tc>
-        <w:tc>
-          <w:tcPr>
-            <w:tcW w:w="1050" w:type="dxa"/>
-          </w:tcPr>
-          <w:p>
-            <w:pPr>
-              <w:spacing w:after="40"/>
-            </w:pPr>
-            <w:r>
-              <w:rPr>
-                <w:sz w:val="16"/>
-                <w:lang w:val="en-US"/>
-              </w:rPr>
+              <w:t>immediately after admin records payment</w:t>
+            </w:r>
+          </w:p>
+        </w:tc>
+        <w:tc>
+          <w:tcPr>
+            <w:tcW w:w="1050" w:type="dxa"/>
+          </w:tcPr>
+          <w:p>
+            <w:pPr>
+              <w:spacing w:after="40"/>
+            </w:pPr>
+            <w:r>
+              <w:rPr>
+                <w:sz w:val="16"/>
+                <w:lang w:val="en-US"/>
+              </w:rPr>
+              <w:lastRenderedPageBreak/>
               <w:t>Student has a "Due" status</w:t>
             </w:r>
           </w:p>
@@ -4488,23 +4521,32 @@
                 <w:sz w:val="16"/>
                 <w:lang w:val="en-US"/>
               </w:rPr>
-              <w:t>1. Admin records a full payment for the student 2. Student logs in and views dashboard</w:t>
-            </w:r>
-          </w:p>
-        </w:tc>
-        <w:tc>
-          <w:tcPr>
-            <w:tcW w:w="1050" w:type="dxa"/>
-          </w:tcPr>
-          <w:p>
-            <w:pPr>
-              <w:spacing w:after="40"/>
-            </w:pPr>
-            <w:r>
-              <w:rPr>
-                <w:sz w:val="16"/>
-                <w:lang w:val="en-US"/>
-              </w:rPr>
+              <w:t xml:space="preserve">1. Admin records a full payment for the student 2. </w:t>
+            </w:r>
+            <w:r>
+              <w:rPr>
+                <w:sz w:val="16"/>
+                <w:lang w:val="en-US"/>
+              </w:rPr>
+              <w:lastRenderedPageBreak/>
+              <w:t>Student logs in and views dashboard</w:t>
+            </w:r>
+          </w:p>
+        </w:tc>
+        <w:tc>
+          <w:tcPr>
+            <w:tcW w:w="1050" w:type="dxa"/>
+          </w:tcPr>
+          <w:p>
+            <w:pPr>
+              <w:spacing w:after="40"/>
+            </w:pPr>
+            <w:r>
+              <w:rPr>
+                <w:sz w:val="16"/>
+                <w:lang w:val="en-US"/>
+              </w:rPr>
+              <w:lastRenderedPageBreak/>
               <w:t>Student: PES1UG23CS001</w:t>
             </w:r>
           </w:p>
@@ -4522,7 +4564,15 @@
                 <w:sz w:val="16"/>
                 <w:lang w:val="en-US"/>
               </w:rPr>
-              <w:t>Student dashboard shows fee status as "Paid" without delay/refresh issues</w:t>
+              <w:t xml:space="preserve">Student dashboard shows fee status as "Paid" </w:t>
+            </w:r>
+            <w:r>
+              <w:rPr>
+                <w:sz w:val="16"/>
+                <w:lang w:val="en-US"/>
+              </w:rPr>
+              <w:lastRenderedPageBreak/>
+              <w:t>without delay/refresh issues</w:t>
             </w:r>
           </w:p>
         </w:tc>
@@ -5751,75 +5801,92 @@
                 <w:sz w:val="16"/>
                 <w:lang w:val="en-US"/>
               </w:rPr>
+              <w:t>IT-08</w:t>
+            </w:r>
+          </w:p>
+        </w:tc>
+        <w:tc>
+          <w:tcPr>
+            <w:tcW w:w="850" w:type="dxa"/>
+          </w:tcPr>
+          <w:p>
+            <w:pPr>
+              <w:spacing w:after="40"/>
+            </w:pPr>
+            <w:r>
+              <w:rPr>
+                <w:sz w:val="16"/>
+                <w:lang w:val="en-US"/>
+              </w:rPr>
+              <w:t>Complaint Management</w:t>
+            </w:r>
+          </w:p>
+        </w:tc>
+        <w:tc>
+          <w:tcPr>
+            <w:tcW w:w="1300" w:type="dxa"/>
+          </w:tcPr>
+          <w:p>
+            <w:pPr>
+              <w:spacing w:after="40"/>
+            </w:pPr>
+            <w:r>
+              <w:rPr>
+                <w:sz w:val="16"/>
+                <w:lang w:val="en-US"/>
+              </w:rPr>
+              <w:t xml:space="preserve">Verify student can view complaint history with </w:t>
+            </w:r>
+            <w:r>
+              <w:rPr>
+                <w:sz w:val="16"/>
+                <w:lang w:val="en-US"/>
+              </w:rPr>
               <w:lastRenderedPageBreak/>
-              <w:t>IT-08</w:t>
-            </w:r>
-          </w:p>
-        </w:tc>
-        <w:tc>
-          <w:tcPr>
-            <w:tcW w:w="850" w:type="dxa"/>
-          </w:tcPr>
-          <w:p>
-            <w:pPr>
-              <w:spacing w:after="40"/>
-            </w:pPr>
-            <w:r>
-              <w:rPr>
-                <w:sz w:val="16"/>
-                <w:lang w:val="en-US"/>
-              </w:rPr>
-              <w:t>Complaint Management</w:t>
-            </w:r>
-          </w:p>
-        </w:tc>
-        <w:tc>
-          <w:tcPr>
-            <w:tcW w:w="1300" w:type="dxa"/>
-          </w:tcPr>
-          <w:p>
-            <w:pPr>
-              <w:spacing w:after="40"/>
-            </w:pPr>
-            <w:r>
-              <w:rPr>
-                <w:sz w:val="16"/>
-                <w:lang w:val="en-US"/>
-              </w:rPr>
-              <w:t>Verify student can view complaint history with correct timestamps</w:t>
-            </w:r>
-          </w:p>
-        </w:tc>
-        <w:tc>
-          <w:tcPr>
-            <w:tcW w:w="1050" w:type="dxa"/>
-          </w:tcPr>
-          <w:p>
-            <w:pPr>
-              <w:spacing w:after="40"/>
-            </w:pPr>
-            <w:r>
-              <w:rPr>
-                <w:sz w:val="16"/>
-                <w:lang w:val="en-US"/>
-              </w:rPr>
-              <w:t>Student has one or more complaints with status changes</w:t>
-            </w:r>
-          </w:p>
-        </w:tc>
-        <w:tc>
-          <w:tcPr>
-            <w:tcW w:w="1300" w:type="dxa"/>
-          </w:tcPr>
-          <w:p>
-            <w:pPr>
-              <w:spacing w:after="40"/>
-            </w:pPr>
-            <w:r>
-              <w:rPr>
-                <w:sz w:val="16"/>
-                <w:lang w:val="en-US"/>
-              </w:rPr>
+              <w:t>correct timestamps</w:t>
+            </w:r>
+          </w:p>
+        </w:tc>
+        <w:tc>
+          <w:tcPr>
+            <w:tcW w:w="1050" w:type="dxa"/>
+          </w:tcPr>
+          <w:p>
+            <w:pPr>
+              <w:spacing w:after="40"/>
+            </w:pPr>
+            <w:r>
+              <w:rPr>
+                <w:sz w:val="16"/>
+                <w:lang w:val="en-US"/>
+              </w:rPr>
+              <w:lastRenderedPageBreak/>
+              <w:t xml:space="preserve">Student has one or more complaints </w:t>
+            </w:r>
+            <w:r>
+              <w:rPr>
+                <w:sz w:val="16"/>
+                <w:lang w:val="en-US"/>
+              </w:rPr>
+              <w:lastRenderedPageBreak/>
+              <w:t>with status changes</w:t>
+            </w:r>
+          </w:p>
+        </w:tc>
+        <w:tc>
+          <w:tcPr>
+            <w:tcW w:w="1300" w:type="dxa"/>
+          </w:tcPr>
+          <w:p>
+            <w:pPr>
+              <w:spacing w:after="40"/>
+            </w:pPr>
+            <w:r>
+              <w:rPr>
+                <w:sz w:val="16"/>
+                <w:lang w:val="en-US"/>
+              </w:rPr>
+              <w:lastRenderedPageBreak/>
               <w:t>1. Student logs in 2. Navigates to Complaint History</w:t>
             </w:r>
           </w:p>
@@ -5854,7 +5921,15 @@
                 <w:sz w:val="16"/>
                 <w:lang w:val="en-US"/>
               </w:rPr>
-              <w:t>Complaint list displayed with submission timestamp, current status, and remarks, in correct order</w:t>
+              <w:t xml:space="preserve">Complaint list displayed with submission timestamp, </w:t>
+            </w:r>
+            <w:r>
+              <w:rPr>
+                <w:sz w:val="16"/>
+                <w:lang w:val="en-US"/>
+              </w:rPr>
+              <w:lastRenderedPageBreak/>
+              <w:t>current status, and remarks, in correct order</w:t>
             </w:r>
           </w:p>
         </w:tc>
@@ -6976,84 +7051,57 @@
                 <w:sz w:val="16"/>
                 <w:lang w:val="en-US"/>
               </w:rPr>
-              <w:t xml:space="preserve">Log exit timestamp for </w:t>
-            </w:r>
-            <w:r>
-              <w:rPr>
-                <w:sz w:val="16"/>
-                <w:lang w:val="en-US"/>
-              </w:rPr>
-              <w:lastRenderedPageBreak/>
-              <w:t>an existing visitor entry</w:t>
-            </w:r>
-          </w:p>
-        </w:tc>
-        <w:tc>
-          <w:tcPr>
-            <w:tcW w:w="1050" w:type="dxa"/>
-          </w:tcPr>
-          <w:p>
-            <w:pPr>
-              <w:spacing w:after="40"/>
-            </w:pPr>
-            <w:r>
-              <w:rPr>
-                <w:sz w:val="16"/>
-                <w:lang w:val="en-US"/>
-              </w:rPr>
-              <w:lastRenderedPageBreak/>
-              <w:t xml:space="preserve">A visitor entry exists </w:t>
-            </w:r>
-            <w:r>
-              <w:rPr>
-                <w:sz w:val="16"/>
-                <w:lang w:val="en-US"/>
-              </w:rPr>
-              <w:lastRenderedPageBreak/>
-              <w:t>without an exit time</w:t>
-            </w:r>
-          </w:p>
-        </w:tc>
-        <w:tc>
-          <w:tcPr>
-            <w:tcW w:w="1300" w:type="dxa"/>
-          </w:tcPr>
-          <w:p>
-            <w:pPr>
-              <w:spacing w:after="40"/>
-            </w:pPr>
-            <w:r>
-              <w:rPr>
-                <w:sz w:val="16"/>
-                <w:lang w:val="en-US"/>
-              </w:rPr>
-              <w:lastRenderedPageBreak/>
-              <w:t xml:space="preserve">1. Select the visitor's entry record 2. Enter </w:t>
-            </w:r>
-            <w:r>
-              <w:rPr>
-                <w:sz w:val="16"/>
-                <w:lang w:val="en-US"/>
-              </w:rPr>
-              <w:lastRenderedPageBreak/>
-              <w:t>exit timestamp 3. Submit</w:t>
-            </w:r>
-          </w:p>
-        </w:tc>
-        <w:tc>
-          <w:tcPr>
-            <w:tcW w:w="1050" w:type="dxa"/>
-          </w:tcPr>
-          <w:p>
-            <w:pPr>
-              <w:spacing w:after="40"/>
-            </w:pPr>
-            <w:r>
-              <w:rPr>
-                <w:sz w:val="16"/>
-                <w:lang w:val="en-US"/>
-              </w:rPr>
-              <w:lastRenderedPageBreak/>
+              <w:t>Log exit timestamp for an existing visitor entry</w:t>
+            </w:r>
+          </w:p>
+        </w:tc>
+        <w:tc>
+          <w:tcPr>
+            <w:tcW w:w="1050" w:type="dxa"/>
+          </w:tcPr>
+          <w:p>
+            <w:pPr>
+              <w:spacing w:after="40"/>
+            </w:pPr>
+            <w:r>
+              <w:rPr>
+                <w:sz w:val="16"/>
+                <w:lang w:val="en-US"/>
+              </w:rPr>
+              <w:t>A visitor entry exists without an exit time</w:t>
+            </w:r>
+          </w:p>
+        </w:tc>
+        <w:tc>
+          <w:tcPr>
+            <w:tcW w:w="1300" w:type="dxa"/>
+          </w:tcPr>
+          <w:p>
+            <w:pPr>
+              <w:spacing w:after="40"/>
+            </w:pPr>
+            <w:r>
+              <w:rPr>
+                <w:sz w:val="16"/>
+                <w:lang w:val="en-US"/>
+              </w:rPr>
+              <w:t>1. Select the visitor's entry record 2. Enter exit timestamp 3. Submit</w:t>
+            </w:r>
+          </w:p>
+        </w:tc>
+        <w:tc>
+          <w:tcPr>
+            <w:tcW w:w="1050" w:type="dxa"/>
+          </w:tcPr>
+          <w:p>
+            <w:pPr>
+              <w:spacing w:after="40"/>
+            </w:pPr>
+            <w:r>
+              <w:rPr>
+                <w:sz w:val="16"/>
+                <w:lang w:val="en-US"/>
+              </w:rPr>
               <w:t>Exit: 08-Sep-2026 11:30 AM</w:t>
             </w:r>
           </w:p>
@@ -7110,6 +7158,7 @@
                 <w:sz w:val="16"/>
                 <w:lang w:val="en-US"/>
               </w:rPr>
+              <w:lastRenderedPageBreak/>
               <w:t>IT-09</w:t>
             </w:r>
           </w:p>
@@ -8309,15 +8358,7 @@
           <w:sz w:val="28"/>
           <w:lang w:val="en-US"/>
         </w:rPr>
-        <w:t xml:space="preserve">NFR-001 (200 concurrent users) is not independently verified in this test plan, as load-testing infrastructure is outside the scope of the mini-project </w:t>
-      </w:r>
-      <w:r>
-        <w:rPr>
-          <w:sz w:val="28"/>
-          <w:lang w:val="en-US"/>
-        </w:rPr>
-        <w:lastRenderedPageBreak/>
-        <w:t>deployment environment; it is treated as a design-intent requirement per the SRS.</w:t>
+        <w:t>NFR-001 (200 concurrent users) is not independently verified in this test plan, as load-testing infrastructure is outside the scope of the mini-project deployment environment; it is treated as a design-intent requirement per the SRS.</w:t>
       </w:r>
     </w:p>
     <w:sectPr>

</xml_diff>